<commit_message>
feat: harden calculation book preflight and exact reinforcement results
</commit_message>
<xml_diff>
--- a/documents_bin/calculation_book/内部结构计算书.docx
+++ b/documents_bin/calculation_book/内部结构计算书.docx
@@ -46141,91 +46141,79 @@
           <w:rFonts w:hAnsi="宋体"/>
           <w:color w:val="EE0000"/>
         </w:rPr>
-        <w:t>墙</w:t>
+        <w:t>{{ item.narrative }}</w:t>
       </w:r>
       <w:r>
         <w:rPr>
           <w:rFonts w:hAnsi="宋体"/>
           <w:color w:val="EE0000"/>
         </w:rPr>
-        <w:t>{{ item.caption }}</w:t>
       </w:r>
       <w:r>
         <w:rPr>
           <w:rFonts w:hAnsi="宋体"/>
           <w:color w:val="EE0000"/>
         </w:rPr>
-        <w:t>钢筋计算配筋面积大部分小于</w:t>
       </w:r>
       <w:r>
         <w:rPr>
           <w:rFonts w:hAnsi="宋体"/>
           <w:color w:val="EE0000"/>
         </w:rPr>
-        <w:t>{{ item.sm_value }}mm</w:t>
       </w:r>
       <w:r>
         <w:rPr>
           <w:rFonts w:hAnsi="宋体"/>
           <w:color w:val="EE0000"/>
         </w:rPr>
-        <w:t>²</w:t>
       </w:r>
       <w:r>
         <w:rPr>
           <w:rFonts w:hAnsi="宋体"/>
           <w:color w:val="EE0000"/>
         </w:rPr>
-        <w:t>/m</w:t>
       </w:r>
       <w:r>
         <w:rPr>
           <w:rFonts w:hAnsi="宋体"/>
           <w:color w:val="EE0000"/>
         </w:rPr>
-        <w:t>。抗大飞机计算结果：选用钢筋</w:t>
       </w:r>
       <w:r>
         <w:rPr>
           <w:rFonts w:hAnsi="宋体"/>
           <w:color w:val="EE0000"/>
         </w:rPr>
-        <w:t>{{ item.rebar_spec }}</w:t>
       </w:r>
       <w:r>
         <w:rPr>
           <w:rFonts w:hAnsi="宋体"/>
           <w:color w:val="EE0000"/>
         </w:rPr>
-        <w:t>（配筋面积为</w:t>
       </w:r>
       <w:r>
         <w:rPr>
           <w:rFonts w:hAnsi="宋体"/>
           <w:color w:val="EE0000"/>
         </w:rPr>
-        <w:t>{{ item.rebar_area }}mm</w:t>
       </w:r>
       <w:r>
         <w:rPr>
           <w:rFonts w:hAnsi="宋体"/>
           <w:color w:val="EE0000"/>
         </w:rPr>
-        <w:t>²</w:t>
       </w:r>
       <w:r>
         <w:rPr>
           <w:rFonts w:hAnsi="宋体"/>
           <w:color w:val="EE0000"/>
         </w:rPr>
-        <w:t>/m</w:t>
       </w:r>
       <w:r>
         <w:rPr>
           <w:rFonts w:hAnsi="宋体"/>
           <w:color w:val="EE0000"/>
         </w:rPr>
-        <w:t>）。综合考虑整体计算及抗大飞机计算结果，配筋结果包络计算结果。</w:t>
       </w:r>
     </w:p>
     <w:p>

</xml_diff>

<commit_message>
feat: render optional slab reinforcement results
</commit_message>
<xml_diff>
--- a/documents_bin/calculation_book/内部结构计算书.docx
+++ b/documents_bin/calculation_book/内部结构计算书.docx
@@ -45846,20 +45846,7 @@
         <w:rPr>
           <w:b/>
         </w:rPr>
-        <w:t xml:space="preserve">7.1 </w:t>
-      </w:r>
-      <w:r>
-        <w:rPr>
-          <w:rFonts w:hint="eastAsia"/>
-          <w:b/>
-        </w:rPr>
-        <w:t>墙体</w:t>
-      </w:r>
-      <w:r>
-        <w:rPr>
-          <w:b/>
-        </w:rPr>
-        <w:t>配筋计算结果</w:t>
+        <w:t>7.1 {% if include_slab_stress %}楼板与墙体单侧{% else %}墙体{% endif %}配筋计算结果</w:t>
       </w:r>
     </w:p>
     <w:bookmarkEnd w:id="32"/>
@@ -45924,6 +45911,141 @@
           <w:rFonts w:hAnsi="宋体" w:hint="eastAsia"/>
         </w:rPr>
         <w:t>板交接处及个别阴角等应力集中区。</w:t>
+      </w:r>
+    </w:p>
+    <w:p>
+      <w:pPr>
+        <w:spacing w:line="300" w:lineRule="auto"/>
+        <w:ind w:firstLineChars="200" w:firstLine="480"/>
+        <w:rPr>
+          <w:rFonts w:hAnsi="宋体" w:hint="eastAsia"/>
+          <w:color w:val="EE0000"/>
+        </w:rPr>
+      </w:pPr>
+      <w:r>
+        <w:rPr>
+          <w:rFonts w:hAnsi="宋体"/>
+          <w:color w:val="EE0000"/>
+        </w:rPr>
+        <w:t>{% if include_slab_stress %}</w:t>
+      </w:r>
+    </w:p>
+    <w:p>
+      <w:pPr>
+        <w:spacing w:line="300" w:lineRule="auto"/>
+        <w:ind w:firstLineChars="200" w:firstLine="480"/>
+        <w:rPr>
+          <w:rFonts w:hAnsi="宋体" w:hint="eastAsia"/>
+        </w:rPr>
+      </w:pPr>
+      <w:r>
+        <w:rPr>
+          <w:rFonts w:hAnsi="宋体" w:hint="eastAsia"/>
+        </w:rPr>
+        <w:t>楼板的配筋计算结果如下。配筋结果为单侧配筋量、其单位为mm2/m。</w:t>
+      </w:r>
+    </w:p>
+    <w:p>
+      <w:pPr>
+        <w:spacing w:line="300" w:lineRule="auto"/>
+        <w:ind w:firstLineChars="200" w:firstLine="480"/>
+        <w:rPr>
+          <w:rFonts w:hAnsi="宋体" w:hint="eastAsia"/>
+          <w:color w:val="EE0000"/>
+        </w:rPr>
+      </w:pPr>
+      <w:r>
+        <w:rPr>
+          <w:rFonts w:hAnsi="宋体"/>
+          <w:color w:val="EE0000"/>
+        </w:rPr>
+        <w:t>{% for item in slab_figures %}</w:t>
+      </w:r>
+    </w:p>
+    <w:p>
+      <w:pPr>
+        <w:spacing w:line="300" w:lineRule="auto"/>
+        <w:ind w:firstLineChars="200" w:firstLine="480"/>
+        <w:rPr>
+          <w:rFonts w:hAnsi="宋体" w:hint="eastAsia"/>
+          <w:color w:val="EE0000"/>
+        </w:rPr>
+      </w:pPr>
+      <w:r>
+        <w:rPr>
+          <w:rFonts w:hAnsi="宋体"/>
+          <w:color w:val="EE0000"/>
+        </w:rPr>
+        <w:t>{{ item.image }}</w:t>
+      </w:r>
+    </w:p>
+    <w:p>
+      <w:pPr>
+        <w:spacing w:line="300" w:lineRule="auto"/>
+        <w:ind w:firstLineChars="200" w:firstLine="480"/>
+        <w:jc w:val="center"/>
+        <w:rPr>
+          <w:rFonts w:hAnsi="宋体" w:hint="eastAsia"/>
+          <w:color w:val="EE0000"/>
+        </w:rPr>
+      </w:pPr>
+      <w:r>
+        <w:rPr>
+          <w:rFonts w:hAnsi="宋体" w:hint="eastAsia"/>
+          <w:color w:val="EE0000"/>
+        </w:rPr>
+        <w:t>图{{ item.figure_number }} {{ item.caption }}配筋云图（mm2/m）</w:t>
+      </w:r>
+    </w:p>
+    <w:p>
+      <w:pPr>
+        <w:spacing w:line="300" w:lineRule="auto"/>
+        <w:ind w:firstLineChars="200" w:firstLine="480"/>
+        <w:rPr>
+          <w:rFonts w:hAnsi="宋体" w:hint="eastAsia"/>
+          <w:color w:val="EE0000"/>
+        </w:rPr>
+      </w:pPr>
+      <w:r>
+        <w:rPr>
+          <w:rFonts w:hAnsi="宋体"/>
+          <w:color w:val="EE0000"/>
+        </w:rPr>
+        <w:t>{{ item.narrative }}</w:t>
+      </w:r>
+    </w:p>
+    <w:p>
+      <w:pPr>
+        <w:spacing w:line="300" w:lineRule="auto"/>
+        <w:ind w:firstLineChars="200" w:firstLine="480"/>
+        <w:rPr>
+          <w:rFonts w:hAnsi="宋体" w:hint="eastAsia"/>
+          <w:color w:val="EE0000"/>
+        </w:rPr>
+      </w:pPr>
+      <w:r>
+        <w:rPr>
+          <w:color w:val="EE0000"/>
+          <w:highlight w:val="yellow"/>
+        </w:rPr>
+        <w:t>{% endfor %}</w:t>
+      </w:r>
+    </w:p>
+    <w:p>
+      <w:pPr>
+        <w:spacing w:line="300" w:lineRule="auto"/>
+        <w:ind w:firstLineChars="200" w:firstLine="480"/>
+        <w:rPr>
+          <w:rFonts w:hAnsi="宋体" w:hint="eastAsia"/>
+          <w:color w:val="EE0000"/>
+        </w:rPr>
+      </w:pPr>
+      <w:r>
+        <w:rPr>
+          <w:color w:val="EE0000"/>
+          <w:highlight w:val="yellow"/>
+        </w:rPr>
+        <w:t>{% endif %}</w:t>
       </w:r>
     </w:p>
     <w:p>

</xml_diff>

<commit_message>
feat: render AI rebar calculation books
</commit_message>
<xml_diff>
--- a/documents_bin/calculation_book/内部结构计算书.docx
+++ b/documents_bin/calculation_book/内部结构计算书.docx
@@ -45911,6 +45911,12 @@
           <w:rFonts w:hAnsi="宋体" w:hint="eastAsia"/>
         </w:rPr>
         <w:t>板交接处及个别阴角等应力集中区。</w:t>
+      </w:r>
+    </w:p>
+    <w:p>
+      <w:pPr/>
+      <w:r>
+        <w:t>{{ ai_rebar_disclosure }}</w:t>
       </w:r>
     </w:p>
     <w:p>

</xml_diff>

<commit_message>
feat: complete calculation book AI normalization and cover code
</commit_message>
<xml_diff>
--- a/documents_bin/calculation_book/内部结构计算书.docx
+++ b/documents_bin/calculation_book/内部结构计算书.docx
@@ -6979,6 +6979,9 @@
                 <w:tab w:val="left" w:pos="7797"/>
               </w:tabs>
             </w:pPr>
+            <w:r>
+              <w:t>{{ cover_code_1 }}</w:t>
+            </w:r>
           </w:p>
         </w:tc>
         <w:tc>
@@ -6996,6 +6999,9 @@
                 <w:tab w:val="left" w:pos="7797"/>
               </w:tabs>
             </w:pPr>
+            <w:r>
+              <w:t>{{ cover_code_2 }}</w:t>
+            </w:r>
           </w:p>
         </w:tc>
         <w:tc>
@@ -7013,6 +7019,9 @@
               </w:tabs>
               <w:spacing w:line="0" w:lineRule="atLeast"/>
             </w:pPr>
+            <w:r>
+              <w:t>{{ cover_code_3 }}</w:t>
+            </w:r>
           </w:p>
         </w:tc>
         <w:tc>
@@ -7031,6 +7040,9 @@
               </w:tabs>
               <w:spacing w:line="0" w:lineRule="atLeast"/>
             </w:pPr>
+            <w:r>
+              <w:t>{{ cover_code_4 }}</w:t>
+            </w:r>
           </w:p>
         </w:tc>
         <w:tc>
@@ -7049,6 +7061,9 @@
               </w:tabs>
               <w:spacing w:line="0" w:lineRule="atLeast"/>
             </w:pPr>
+            <w:r>
+              <w:t>{{ cover_code_5 }}</w:t>
+            </w:r>
           </w:p>
         </w:tc>
         <w:tc>
@@ -7067,6 +7082,9 @@
               </w:tabs>
               <w:spacing w:line="0" w:lineRule="atLeast"/>
             </w:pPr>
+            <w:r>
+              <w:t>{{ cover_code_6 }}</w:t>
+            </w:r>
           </w:p>
         </w:tc>
         <w:tc>

</xml_diff>